<commit_message>
fixed some typo error
</commit_message>
<xml_diff>
--- a/TỔNG HỢP KANJI JPD316.docx
+++ b/TỔNG HỢP KANJI JPD316.docx
@@ -142,7 +142,6 @@
             <w:pPr>
               <w:jc w:val="center"/>
               <w:rPr>
-                <w:rFonts w:hint="eastAsia"/>
                 <w:b/>
                 <w:bCs/>
                 <w:sz w:val="24"/>
@@ -235,7 +234,6 @@
           <w:p>
             <w:pPr>
               <w:rPr>
-                <w:rFonts w:hint="eastAsia"/>
                 <w:b/>
                 <w:bCs/>
                 <w:sz w:val="22"/>
@@ -274,7 +272,29 @@
                 <w:szCs w:val="20"/>
                 <w:lang w:val="en-US"/>
               </w:rPr>
-              <w:t>まいる</w:t>
+              <w:t>まい</w:t>
+            </w:r>
+            <w:r>
+              <w:rPr>
+                <w:rFonts w:hint="eastAsia"/>
+                <w:b/>
+                <w:bCs/>
+                <w:sz w:val="22"/>
+                <w:szCs w:val="20"/>
+                <w:lang w:val="en-US"/>
+              </w:rPr>
+              <w:t>・</w:t>
+            </w:r>
+            <w:r>
+              <w:rPr>
+                <w:rFonts w:hint="eastAsia"/>
+                <w:b/>
+                <w:bCs/>
+                <w:sz w:val="22"/>
+                <w:szCs w:val="20"/>
+                <w:lang w:val="en-US"/>
+              </w:rPr>
+              <w:t>る</w:t>
             </w:r>
           </w:p>
         </w:tc>
@@ -365,7 +385,6 @@
           <w:p>
             <w:pPr>
               <w:rPr>
-                <w:rFonts w:hint="eastAsia"/>
                 <w:sz w:val="22"/>
                 <w:szCs w:val="20"/>
                 <w:lang w:val="en-US"/>
@@ -419,7 +438,6 @@
           <w:p>
             <w:pPr>
               <w:rPr>
-                <w:rFonts w:hint="eastAsia"/>
                 <w:sz w:val="22"/>
                 <w:szCs w:val="20"/>
                 <w:lang w:val="en-US"/>
@@ -467,7 +485,6 @@
           <w:p>
             <w:pPr>
               <w:rPr>
-                <w:rFonts w:hint="eastAsia"/>
                 <w:sz w:val="22"/>
                 <w:szCs w:val="20"/>
                 <w:lang w:val="en-US"/>
@@ -502,7 +519,6 @@
             <w:pPr>
               <w:jc w:val="center"/>
               <w:rPr>
-                <w:rFonts w:hint="eastAsia"/>
                 <w:b/>
                 <w:bCs/>
                 <w:sz w:val="48"/>
@@ -635,7 +651,6 @@
           <w:p>
             <w:pPr>
               <w:rPr>
-                <w:rFonts w:hint="eastAsia"/>
                 <w:sz w:val="22"/>
                 <w:szCs w:val="20"/>
                 <w:lang w:val="en-US"/>
@@ -702,7 +717,6 @@
             <w:pPr>
               <w:jc w:val="center"/>
               <w:rPr>
-                <w:rFonts w:hint="eastAsia"/>
                 <w:b/>
                 <w:bCs/>
                 <w:sz w:val="48"/>
@@ -766,7 +780,6 @@
           <w:p>
             <w:pPr>
               <w:rPr>
-                <w:rFonts w:hint="eastAsia"/>
                 <w:sz w:val="22"/>
                 <w:szCs w:val="20"/>
                 <w:lang w:val="en-US"/>
@@ -832,34 +845,7 @@
                 <w:szCs w:val="20"/>
                 <w:lang w:val="en-US"/>
               </w:rPr>
-              <w:t>加入</w:t>
-            </w:r>
-            <w:r>
-              <w:rPr>
-                <w:rFonts w:hint="eastAsia"/>
-                <w:sz w:val="22"/>
-                <w:szCs w:val="20"/>
-                <w:lang w:val="en-US"/>
-              </w:rPr>
-              <w:t>（</w:t>
-            </w:r>
-            <w:r>
-              <w:rPr>
-                <w:rFonts w:hint="eastAsia"/>
-                <w:sz w:val="22"/>
-                <w:szCs w:val="20"/>
-                <w:lang w:val="en-US"/>
-              </w:rPr>
-              <w:t>かにゅう</w:t>
-            </w:r>
-            <w:r>
-              <w:rPr>
-                <w:rFonts w:hint="eastAsia"/>
-                <w:sz w:val="22"/>
-                <w:szCs w:val="20"/>
-                <w:lang w:val="en-US"/>
-              </w:rPr>
-              <w:t>）</w:t>
+              <w:t>加入（かにゅう）</w:t>
             </w:r>
             <w:r>
               <w:rPr>
@@ -963,27 +949,7 @@
                 <w:szCs w:val="24"/>
                 <w:lang w:val="en-US"/>
               </w:rPr>
-              <w:t>(</w:t>
-            </w:r>
-            <w:r>
-              <w:rPr>
-                <w:b/>
-                <w:bCs/>
-                <w:sz w:val="24"/>
-                <w:szCs w:val="24"/>
-                <w:lang w:val="en-US"/>
-              </w:rPr>
-              <w:t>LƯU</w:t>
-            </w:r>
-            <w:r>
-              <w:rPr>
-                <w:b/>
-                <w:bCs/>
-                <w:sz w:val="24"/>
-                <w:szCs w:val="24"/>
-                <w:lang w:val="en-US"/>
-              </w:rPr>
-              <w:t>)</w:t>
+              <w:t>(LƯU)</w:t>
             </w:r>
           </w:p>
         </w:tc>
@@ -1124,7 +1090,6 @@
             <w:pPr>
               <w:jc w:val="center"/>
               <w:rPr>
-                <w:rFonts w:hint="eastAsia"/>
                 <w:b/>
                 <w:bCs/>
                 <w:sz w:val="48"/>
@@ -1196,7 +1161,6 @@
           <w:p>
             <w:pPr>
               <w:rPr>
-                <w:rFonts w:hint="eastAsia"/>
                 <w:sz w:val="22"/>
                 <w:szCs w:val="20"/>
                 <w:lang w:val="en-US"/>
@@ -1279,15 +1243,7 @@
                 <w:szCs w:val="20"/>
                 <w:lang w:val="en-US"/>
               </w:rPr>
-              <w:t>gia</w:t>
-            </w:r>
-            <w:r>
-              <w:rPr>
-                <w:sz w:val="22"/>
-                <w:szCs w:val="20"/>
-                <w:lang w:val="en-US"/>
-              </w:rPr>
-              <w:t>o lưu</w:t>
+              <w:t>giao lưu</w:t>
             </w:r>
           </w:p>
         </w:tc>
@@ -1366,7 +1322,6 @@
             <w:pPr>
               <w:jc w:val="center"/>
               <w:rPr>
-                <w:rFonts w:hint="eastAsia"/>
                 <w:b/>
                 <w:bCs/>
                 <w:sz w:val="48"/>
@@ -1403,27 +1358,7 @@
                 <w:szCs w:val="24"/>
                 <w:lang w:val="en-US"/>
               </w:rPr>
-              <w:t>(</w:t>
-            </w:r>
-            <w:r>
-              <w:rPr>
-                <w:b/>
-                <w:bCs/>
-                <w:sz w:val="24"/>
-                <w:szCs w:val="24"/>
-                <w:lang w:val="en-US"/>
-              </w:rPr>
-              <w:t>HIỆP</w:t>
-            </w:r>
-            <w:r>
-              <w:rPr>
-                <w:b/>
-                <w:bCs/>
-                <w:sz w:val="24"/>
-                <w:szCs w:val="24"/>
-                <w:lang w:val="en-US"/>
-              </w:rPr>
-              <w:t>)</w:t>
+              <w:t>(HIỆP)</w:t>
             </w:r>
           </w:p>
         </w:tc>
@@ -1516,7 +1451,6 @@
             <w:pPr>
               <w:jc w:val="center"/>
               <w:rPr>
-                <w:rFonts w:hint="eastAsia"/>
                 <w:b/>
                 <w:bCs/>
                 <w:sz w:val="48"/>
@@ -1590,7 +1524,6 @@
           <w:p>
             <w:pPr>
               <w:rPr>
-                <w:rFonts w:hint="eastAsia"/>
                 <w:sz w:val="22"/>
                 <w:szCs w:val="20"/>
                 <w:lang w:val="en-US"/>
@@ -1728,27 +1661,7 @@
                 <w:szCs w:val="24"/>
                 <w:lang w:val="en-US"/>
               </w:rPr>
-              <w:t>(</w:t>
-            </w:r>
-            <w:r>
-              <w:rPr>
-                <w:b/>
-                <w:bCs/>
-                <w:sz w:val="24"/>
-                <w:szCs w:val="24"/>
-                <w:lang w:val="en-US"/>
-              </w:rPr>
-              <w:t>PHÍ</w:t>
-            </w:r>
-            <w:r>
-              <w:rPr>
-                <w:b/>
-                <w:bCs/>
-                <w:sz w:val="24"/>
-                <w:szCs w:val="24"/>
-                <w:lang w:val="en-US"/>
-              </w:rPr>
-              <w:t>)</w:t>
+              <w:t>(PHÍ)</w:t>
             </w:r>
           </w:p>
         </w:tc>
@@ -1889,7 +1802,6 @@
             <w:pPr>
               <w:jc w:val="center"/>
               <w:rPr>
-                <w:rFonts w:hint="eastAsia"/>
                 <w:b/>
                 <w:bCs/>
                 <w:sz w:val="48"/>
@@ -1961,7 +1873,6 @@
           <w:p>
             <w:pPr>
               <w:rPr>
-                <w:rFonts w:hint="eastAsia"/>
                 <w:sz w:val="22"/>
                 <w:szCs w:val="20"/>
                 <w:lang w:val="en-US"/>
@@ -2000,15 +1911,7 @@
                 <w:szCs w:val="20"/>
                 <w:lang w:val="en-US"/>
               </w:rPr>
-              <w:t>h</w:t>
-            </w:r>
-            <w:r>
-              <w:rPr>
-                <w:sz w:val="22"/>
-                <w:szCs w:val="20"/>
-                <w:lang w:val="en-US"/>
-              </w:rPr>
-              <w:t>ọc phí</w:t>
+              <w:t>học phí</w:t>
             </w:r>
           </w:p>
           <w:p>
@@ -2154,7 +2057,7 @@
                 <w:szCs w:val="40"/>
                 <w:lang w:val="en-US"/>
               </w:rPr>
-              <w:t>費</w:t>
+              <w:t>報</w:t>
             </w:r>
             <w:r>
               <w:rPr>
@@ -2164,27 +2067,7 @@
                 <w:szCs w:val="24"/>
                 <w:lang w:val="en-US"/>
               </w:rPr>
-              <w:t>(</w:t>
-            </w:r>
-            <w:r>
-              <w:rPr>
-                <w:b/>
-                <w:bCs/>
-                <w:sz w:val="24"/>
-                <w:szCs w:val="24"/>
-                <w:lang w:val="en-US"/>
-              </w:rPr>
-              <w:t>BÁO</w:t>
-            </w:r>
-            <w:r>
-              <w:rPr>
-                <w:b/>
-                <w:bCs/>
-                <w:sz w:val="24"/>
-                <w:szCs w:val="24"/>
-                <w:lang w:val="en-US"/>
-              </w:rPr>
-              <w:t>)</w:t>
+              <w:t>(BÁO)</w:t>
             </w:r>
           </w:p>
         </w:tc>
@@ -2347,7 +2230,6 @@
           <w:p>
             <w:pPr>
               <w:rPr>
-                <w:rFonts w:hint="eastAsia"/>
                 <w:sz w:val="22"/>
                 <w:szCs w:val="20"/>
                 <w:lang w:val="en-US"/>
@@ -2504,7 +2386,6 @@
             <w:pPr>
               <w:jc w:val="center"/>
               <w:rPr>
-                <w:rFonts w:hint="eastAsia"/>
                 <w:sz w:val="22"/>
                 <w:szCs w:val="20"/>
                 <w:lang w:val="en-US"/>
@@ -2529,27 +2410,7 @@
                 <w:szCs w:val="24"/>
                 <w:lang w:val="en-US"/>
               </w:rPr>
-              <w:t>(</w:t>
-            </w:r>
-            <w:r>
-              <w:rPr>
-                <w:b/>
-                <w:bCs/>
-                <w:sz w:val="24"/>
-                <w:szCs w:val="24"/>
-                <w:lang w:val="en-US"/>
-              </w:rPr>
-              <w:t>GIÁC</w:t>
-            </w:r>
-            <w:r>
-              <w:rPr>
-                <w:b/>
-                <w:bCs/>
-                <w:sz w:val="24"/>
-                <w:szCs w:val="24"/>
-                <w:lang w:val="en-US"/>
-              </w:rPr>
-              <w:t>)</w:t>
+              <w:t>(GIÁC)</w:t>
             </w:r>
           </w:p>
         </w:tc>
@@ -2876,27 +2737,7 @@
                 <w:szCs w:val="24"/>
                 <w:lang w:val="en-US"/>
               </w:rPr>
-              <w:t>(</w:t>
-            </w:r>
-            <w:r>
-              <w:rPr>
-                <w:b/>
-                <w:bCs/>
-                <w:sz w:val="24"/>
-                <w:szCs w:val="24"/>
-                <w:lang w:val="en-US"/>
-              </w:rPr>
-              <w:t>TỰU</w:t>
-            </w:r>
-            <w:r>
-              <w:rPr>
-                <w:b/>
-                <w:bCs/>
-                <w:sz w:val="24"/>
-                <w:szCs w:val="24"/>
-                <w:lang w:val="en-US"/>
-              </w:rPr>
-              <w:t>)</w:t>
+              <w:t>(TỰU)</w:t>
             </w:r>
           </w:p>
         </w:tc>
@@ -3106,7 +2947,6 @@
           <w:p>
             <w:pPr>
               <w:rPr>
-                <w:rFonts w:hint="eastAsia"/>
                 <w:sz w:val="22"/>
                 <w:szCs w:val="20"/>
                 <w:lang w:val="en-US"/>
@@ -3265,27 +3105,7 @@
                 <w:szCs w:val="24"/>
                 <w:lang w:val="en-US"/>
               </w:rPr>
-              <w:t>(</w:t>
-            </w:r>
-            <w:r>
-              <w:rPr>
-                <w:b/>
-                <w:bCs/>
-                <w:sz w:val="24"/>
-                <w:szCs w:val="24"/>
-                <w:lang w:val="en-US"/>
-              </w:rPr>
-              <w:t>CHỨC</w:t>
-            </w:r>
-            <w:r>
-              <w:rPr>
-                <w:b/>
-                <w:bCs/>
-                <w:sz w:val="24"/>
-                <w:szCs w:val="24"/>
-                <w:lang w:val="en-US"/>
-              </w:rPr>
-              <w:t>)</w:t>
+              <w:t>(CHỨC)</w:t>
             </w:r>
           </w:p>
         </w:tc>
@@ -3447,7 +3267,6 @@
           <w:p>
             <w:pPr>
               <w:rPr>
-                <w:rFonts w:hint="eastAsia"/>
                 <w:sz w:val="22"/>
                 <w:szCs w:val="20"/>
                 <w:lang w:val="en-US"/>
@@ -3503,7 +3322,6 @@
           <w:p>
             <w:pPr>
               <w:rPr>
-                <w:rFonts w:hint="eastAsia"/>
                 <w:sz w:val="22"/>
                 <w:szCs w:val="20"/>
                 <w:lang w:val="en-US"/>
@@ -3598,27 +3416,7 @@
                 <w:szCs w:val="24"/>
                 <w:lang w:val="en-US"/>
               </w:rPr>
-              <w:t>(</w:t>
-            </w:r>
-            <w:r>
-              <w:rPr>
-                <w:b/>
-                <w:bCs/>
-                <w:sz w:val="24"/>
-                <w:szCs w:val="24"/>
-                <w:lang w:val="en-US"/>
-              </w:rPr>
-              <w:t>TẤT</w:t>
-            </w:r>
-            <w:r>
-              <w:rPr>
-                <w:b/>
-                <w:bCs/>
-                <w:sz w:val="24"/>
-                <w:szCs w:val="24"/>
-                <w:lang w:val="en-US"/>
-              </w:rPr>
-              <w:t>)</w:t>
+              <w:t>(TẤT)</w:t>
             </w:r>
           </w:p>
         </w:tc>
@@ -3829,7 +3627,6 @@
           <w:p>
             <w:pPr>
               <w:rPr>
-                <w:rFonts w:hint="eastAsia"/>
                 <w:sz w:val="22"/>
                 <w:szCs w:val="20"/>
                 <w:lang w:val="en-US"/>
@@ -3919,7 +3716,6 @@
             <w:pPr>
               <w:jc w:val="center"/>
               <w:rPr>
-                <w:rFonts w:hint="eastAsia"/>
                 <w:sz w:val="22"/>
                 <w:szCs w:val="20"/>
                 <w:lang w:val="en-US"/>
@@ -3944,27 +3740,7 @@
                 <w:szCs w:val="24"/>
                 <w:lang w:val="en-US"/>
               </w:rPr>
-              <w:t>(</w:t>
-            </w:r>
-            <w:r>
-              <w:rPr>
-                <w:b/>
-                <w:bCs/>
-                <w:sz w:val="24"/>
-                <w:szCs w:val="24"/>
-                <w:lang w:val="en-US"/>
-              </w:rPr>
-              <w:t>YẾU</w:t>
-            </w:r>
-            <w:r>
-              <w:rPr>
-                <w:b/>
-                <w:bCs/>
-                <w:sz w:val="24"/>
-                <w:szCs w:val="24"/>
-                <w:lang w:val="en-US"/>
-              </w:rPr>
-              <w:t>)</w:t>
+              <w:t>(YẾU)</w:t>
             </w:r>
           </w:p>
         </w:tc>
@@ -4106,7 +3882,6 @@
             <w:pPr>
               <w:jc w:val="center"/>
               <w:rPr>
-                <w:rFonts w:hint="eastAsia"/>
                 <w:sz w:val="22"/>
                 <w:szCs w:val="20"/>
                 <w:lang w:val="en-US"/>
@@ -4176,7 +3951,6 @@
           <w:p>
             <w:pPr>
               <w:rPr>
-                <w:rFonts w:hint="eastAsia"/>
                 <w:sz w:val="22"/>
                 <w:szCs w:val="20"/>
                 <w:lang w:val="en-US"/>
@@ -4271,7 +4045,6 @@
           <w:p>
             <w:pPr>
               <w:rPr>
-                <w:rFonts w:hint="eastAsia"/>
                 <w:sz w:val="22"/>
                 <w:szCs w:val="20"/>
                 <w:lang w:val="en-US"/>
@@ -4710,27 +4483,7 @@
                 <w:szCs w:val="24"/>
                 <w:lang w:val="en-US"/>
               </w:rPr>
-              <w:t>(</w:t>
-            </w:r>
-            <w:r>
-              <w:rPr>
-                <w:b/>
-                <w:bCs/>
-                <w:sz w:val="24"/>
-                <w:szCs w:val="24"/>
-                <w:lang w:val="en-US"/>
-              </w:rPr>
-              <w:t>HOÀN</w:t>
-            </w:r>
-            <w:r>
-              <w:rPr>
-                <w:b/>
-                <w:bCs/>
-                <w:sz w:val="24"/>
-                <w:szCs w:val="24"/>
-                <w:lang w:val="en-US"/>
-              </w:rPr>
-              <w:t>)</w:t>
+              <w:t>(HOÀN)</w:t>
             </w:r>
           </w:p>
         </w:tc>
@@ -4914,16 +4667,7 @@
                 <w:szCs w:val="20"/>
                 <w:lang w:val="en-US"/>
               </w:rPr>
-              <w:t>完全（かんぜん</w:t>
-            </w:r>
-            <w:r>
-              <w:rPr>
-                <w:rFonts w:hint="eastAsia"/>
-                <w:sz w:val="22"/>
-                <w:szCs w:val="20"/>
-                <w:lang w:val="en-US"/>
-              </w:rPr>
-              <w:t>）</w:t>
+              <w:t>完全（かんぜん）</w:t>
             </w:r>
             <w:r>
               <w:rPr>
@@ -4995,27 +4739,7 @@
                 <w:szCs w:val="24"/>
                 <w:lang w:val="en-US"/>
               </w:rPr>
-              <w:t>(</w:t>
-            </w:r>
-            <w:r>
-              <w:rPr>
-                <w:b/>
-                <w:bCs/>
-                <w:sz w:val="24"/>
-                <w:szCs w:val="24"/>
-                <w:lang w:val="en-US"/>
-              </w:rPr>
-              <w:t>THÀNH</w:t>
-            </w:r>
-            <w:r>
-              <w:rPr>
-                <w:b/>
-                <w:bCs/>
-                <w:sz w:val="24"/>
-                <w:szCs w:val="24"/>
-                <w:lang w:val="en-US"/>
-              </w:rPr>
-              <w:t>)</w:t>
+              <w:t>(THÀNH)</w:t>
             </w:r>
           </w:p>
         </w:tc>
@@ -5289,7 +5013,6 @@
           <w:p>
             <w:pPr>
               <w:rPr>
-                <w:rFonts w:hint="eastAsia"/>
                 <w:sz w:val="22"/>
                 <w:szCs w:val="20"/>
                 <w:lang w:val="en-US"/>
@@ -5392,17 +5115,7 @@
                 <w:szCs w:val="24"/>
                 <w:lang w:val="en-US"/>
               </w:rPr>
-              <w:t>(NIỆM</w:t>
-            </w:r>
-            <w:r>
-              <w:rPr>
-                <w:b/>
-                <w:bCs/>
-                <w:sz w:val="24"/>
-                <w:szCs w:val="24"/>
-                <w:lang w:val="en-US"/>
-              </w:rPr>
-              <w:t>)</w:t>
+              <w:t>(NIỆM)</w:t>
             </w:r>
           </w:p>
         </w:tc>
@@ -5660,7 +5373,6 @@
           <w:p>
             <w:pPr>
               <w:rPr>
-                <w:rFonts w:hint="eastAsia"/>
                 <w:sz w:val="22"/>
                 <w:szCs w:val="20"/>
                 <w:lang w:val="en-US"/>
@@ -5765,27 +5477,7 @@
                 <w:szCs w:val="24"/>
                 <w:lang w:val="en-US"/>
               </w:rPr>
-              <w:t>(</w:t>
-            </w:r>
-            <w:r>
-              <w:rPr>
-                <w:b/>
-                <w:bCs/>
-                <w:sz w:val="24"/>
-                <w:szCs w:val="24"/>
-                <w:lang w:val="en-US"/>
-              </w:rPr>
-              <w:t>ÔN</w:t>
-            </w:r>
-            <w:r>
-              <w:rPr>
-                <w:b/>
-                <w:bCs/>
-                <w:sz w:val="24"/>
-                <w:szCs w:val="24"/>
-                <w:lang w:val="en-US"/>
-              </w:rPr>
-              <w:t>)</w:t>
+              <w:t>(ÔN)</w:t>
             </w:r>
           </w:p>
         </w:tc>
@@ -6757,6 +6449,7 @@
   <w:style w:type="character" w:default="1" w:styleId="DefaultParagraphFont">
     <w:name w:val="Default Paragraph Font"/>
     <w:uiPriority w:val="1"/>
+    <w:semiHidden/>
     <w:unhideWhenUsed/>
   </w:style>
   <w:style w:type="table" w:default="1" w:styleId="TableNormal">

</xml_diff>